<commit_message>
Reframe manuscript: 'Do Cultural Labels Predict Analgesic Need?'
Strategic pivot per user direction:
- Title: 'Do Cultural Labels Predict Analgesic Need? A 47-Prefecture
  Ecological Study of Pain Prescribing Variation in Japan'
- Target audience broadened from pain specialists to all prescribers
  (surgeons, internists, GPs, anaesthesiologists)
- Introduction reframed: opens with prescribing assumptions, not
  stoicism-challenge narrative
- Discussion enriched with within-country heterogeneity argument
  (Option 5 perspective): if heterogeneity exists within a society
  widely regarded as culturally uniform, national-level stereotypes
  are fragile everywhere
- Conclusion echoes title question with explicit 'no' answer
- JA manuscript updated with matching title and framing
- Cover letter updated with new title and prescriber-agnostic language

Word counts: Abstract 287/300, Body 2659 (~3500 target), Refs 23/30,
Display items 5/5.

Co-Authored-By: Tatsuki Onishi <bougtoir@gmail.com>
</commit_message>
<xml_diff>
--- a/ndb-pain-regional-variation-japan/output/lancet_rh_wp/LRH_cover_letter.docx
+++ b/ndb-pain-regional-variation-japan/output/lancet_rh_wp/LRH_cover_letter.docx
@@ -32,12 +32,12 @@
     <w:p/>
     <w:p>
       <w:r>
-        <w:t>I am pleased to submit the enclosed manuscript entitled “Regional Heterogeneity in Pain-Related Prescribing Across Japan’s 47 Prefectures Challenges a Stoic Monolithic Patient Stereotype: an ecological study” for consideration as an Original Article in The Lancet Regional Health – Western Pacific.</w:t>
+        <w:t>I am pleased to submit the enclosed manuscript entitled “Do Cultural Labels Predict Analgesic Need? A 47-Prefecture Ecological Study of Pain Prescribing Variation in Japan” for consideration as an Original Article in The Lancet Regional Health – Western Pacific.</w:t>
       </w:r>
     </w:p>
     <w:p>
       <w:r>
-        <w:t>Cross-cultural research consistently characterises Japanese people as stoic toward pain, yet all prior comparisons have treated Japan as a culturally homogeneous unit. Using population-complete insurance claims data from Japan’s National Database (NDB Open Data, 10th edition, covering approximately 125 million insured individuals), we mapped perioperative and chronic pain-related prescribing across all 47 prefectures for the first time.</w:t>
+        <w:t>Clinicians frequently rely on cultural labels—such as “Japanese patients are stoic”—when making analgesic prescribing decisions. Yet all prior comparisons have treated Japan as a culturally homogeneous unit. Using population-complete insurance claims data from Japan’s National Database (NDB Open Data, 10th edition, covering approximately 125 million insured individuals), we mapped perioperative and chronic pain-related prescribing across all 47 prefectures for the first time to test whether cultural labels predict analgesic use.</w:t>
       </w:r>
     </w:p>
     <w:p>
@@ -74,7 +74,7 @@
         <w:pStyle w:val="ListBullet"/>
       </w:pPr>
       <w:r>
-        <w:t>These findings demonstrate that Japan’s pain culture is not monolithic, with implications for individualised pain assessment across the Western Pacific region.</w:t>
+        <w:t>These findings demonstrate that cultural labels do not predict analgesic need at the population level, with implications for any clinician—surgeon, internist, or pain specialist—who prescribes analgesics across the Western Pacific region.</w:t>
       </w:r>
     </w:p>
     <w:p/>

</xml_diff>